<commit_message>
Expand verified public-domain corpus
</commit_message>
<xml_diff>
--- a/exports/Hindu_Scriptures_and_Commentaries_Directory.docx
+++ b/exports/Hindu_Scriptures_and_Commentaries_Directory.docx
@@ -7147,11 +7147,2884 @@
         <w:t>The directory was checked against repository pages and item records for SARIT, GRETIL, the Digital Corpus of Sanskrit, Gita Supersite, Muktabodha, Gaudiya Grantha Mandira, Sanskrit Documents, Project Madurai, Vachana Sanchaya, Internet Archive, Sacred Texts, Project Gutenberg, Shaivam.org and Open Library. Links and rights statements can change; recheck the destination before substantial reuse.</w:t>
       </w:r>
     </w:p>
+    <w:p>
+      <w:r>
+        <w:br w:type="page"/>
+      </w:r>
+    </w:p>
+    <w:p>
+      <w:pPr>
+        <w:pStyle w:val="Heading1"/>
+        <w:jc w:val="left"/>
+      </w:pPr>
+      <w:r>
+        <w:t>Verified Mirrored Corpus</w:t>
+      </w:r>
+    </w:p>
+    <w:p>
+      <w:r>
+        <w:rPr>
+          <w:b/>
+        </w:rPr>
+        <w:t xml:space="preserve">Repository: </w:t>
+      </w:r>
+      <w:hyperlink r:id="rId67">
+        <w:r>
+          <w:rPr>
+            <w:color w:val="0F766E"/>
+            <w:u w:val="single"/>
+          </w:rPr>
+          <w:t>georgeanthonypaul-cloud/hindu-scriptures-open-catalog</w:t>
+        </w:r>
+      </w:hyperlink>
+    </w:p>
+    <w:p>
+      <w:r>
+        <w:t>This release mirrors only editions with a documented public-domain basis in the United States or an explicit reusable license. Ancient authorship does not place a modern translation, critical edition, typesetting, or website database in the public domain.</w:t>
+      </w:r>
+    </w:p>
+    <w:tbl>
+      <w:tblPr>
+        <w:tblStyle w:val="TableGrid"/>
+        <w:tblW w:type="auto" w:w="0"/>
+        <w:tblLayout w:type="fixed"/>
+        <w:tblLook w:firstColumn="1" w:firstRow="1" w:lastColumn="0" w:lastRow="0" w:noHBand="0" w:noVBand="1" w:val="04A0"/>
+      </w:tblPr>
+      <w:tblGrid>
+        <w:gridCol w:w="6912"/>
+        <w:gridCol w:w="1728"/>
+      </w:tblGrid>
+      <w:tr>
+        <w:tc>
+          <w:tcPr>
+            <w:tcW w:type="dxa" w:w="4853"/>
+            <w:shd w:fill="0F766E"/>
+          </w:tcPr>
+          <w:p>
+            <w:r>
+              <w:rPr>
+                <w:b/>
+                <w:color w:val="FFFFFF"/>
+              </w:rPr>
+              <w:t>Coverage measure</w:t>
+            </w:r>
+          </w:p>
+        </w:tc>
+        <w:tc>
+          <w:tcPr>
+            <w:tcW w:type="dxa" w:w="4853"/>
+            <w:shd w:fill="0F766E"/>
+          </w:tcPr>
+          <w:p>
+            <w:r>
+              <w:rPr>
+                <w:b/>
+                <w:color w:val="FFFFFF"/>
+              </w:rPr>
+              <w:t>Count</w:t>
+            </w:r>
+          </w:p>
+        </w:tc>
+      </w:tr>
+      <w:tr>
+        <w:tc>
+          <w:tcPr>
+            <w:tcW w:type="dxa" w:w="6912"/>
+          </w:tcPr>
+          <w:p>
+            <w:r>
+              <w:t>Verified mirrored files</w:t>
+            </w:r>
+          </w:p>
+        </w:tc>
+        <w:tc>
+          <w:tcPr>
+            <w:tcW w:type="dxa" w:w="1728"/>
+          </w:tcPr>
+          <w:p>
+            <w:r>
+              <w:t>29</w:t>
+            </w:r>
+          </w:p>
+        </w:tc>
+      </w:tr>
+      <w:tr>
+        <w:tc>
+          <w:tcPr>
+            <w:tcW w:type="dxa" w:w="6912"/>
+          </w:tcPr>
+          <w:p>
+            <w:r>
+              <w:t>Catalogue records with at least partial coverage</w:t>
+            </w:r>
+          </w:p>
+        </w:tc>
+        <w:tc>
+          <w:tcPr>
+            <w:tcW w:type="dxa" w:w="1728"/>
+          </w:tcPr>
+          <w:p>
+            <w:r>
+              <w:t>53</w:t>
+            </w:r>
+          </w:p>
+        </w:tc>
+      </w:tr>
+      <w:tr>
+        <w:tc>
+          <w:tcPr>
+            <w:tcW w:type="dxa" w:w="6912"/>
+          </w:tcPr>
+          <w:p>
+            <w:r>
+              <w:t>Catalogue records pending an exact reusable edition</w:t>
+            </w:r>
+          </w:p>
+        </w:tc>
+        <w:tc>
+          <w:tcPr>
+            <w:tcW w:type="dxa" w:w="1728"/>
+          </w:tcPr>
+          <w:p>
+            <w:r>
+              <w:t>195</w:t>
+            </w:r>
+          </w:p>
+        </w:tc>
+      </w:tr>
+      <w:tr>
+        <w:tc>
+          <w:tcPr>
+            <w:tcW w:type="dxa" w:w="6912"/>
+          </w:tcPr>
+          <w:p>
+            <w:r>
+              <w:t>Total requested catalogue records</w:t>
+            </w:r>
+          </w:p>
+        </w:tc>
+        <w:tc>
+          <w:tcPr>
+            <w:tcW w:type="dxa" w:w="1728"/>
+          </w:tcPr>
+          <w:p>
+            <w:r>
+              <w:t>248</w:t>
+            </w:r>
+          </w:p>
+        </w:tc>
+      </w:tr>
+    </w:tbl>
+    <w:p>
+      <w:pPr>
+        <w:pStyle w:val="IntenseQuote"/>
+      </w:pPr>
+      <w:r>
+        <w:t>Coverage is edition-specific. The SARIT Skandapurāṇa file is a partial critical edition (chapters 1–69), and a mirrored English translation does not imply that a complete Sanskrit-and-English pair is available for that title.</w:t>
+      </w:r>
+    </w:p>
+    <w:p>
+      <w:pPr>
+        <w:pStyle w:val="Heading2"/>
+      </w:pPr>
+      <w:r>
+        <w:t>Included files</w:t>
+      </w:r>
+    </w:p>
+    <w:p>
+      <w:r>
+        <w:t>The Excel workbook contains the full source URL, license URL, attribution, repository destination, verification note, and SHA-256 checksum for every row below.</w:t>
+      </w:r>
+    </w:p>
+    <w:tbl>
+      <w:tblPr>
+        <w:tblStyle w:val="TableGrid"/>
+        <w:tblW w:type="auto" w:w="0"/>
+        <w:tblLayout w:type="fixed"/>
+        <w:tblLook w:firstColumn="1" w:firstRow="1" w:lastColumn="0" w:lastRow="0" w:noHBand="0" w:noVBand="1" w:val="04A0"/>
+      </w:tblPr>
+      <w:tblGrid>
+        <w:gridCol w:w="2808"/>
+        <w:gridCol w:w="1944"/>
+        <w:gridCol w:w="2088"/>
+        <w:gridCol w:w="2880"/>
+      </w:tblGrid>
+      <w:tr>
+        <w:trPr>
+          <w:tblHeader w:val="true"/>
+          <w:cantSplit/>
+        </w:trPr>
+        <w:tc>
+          <w:tcPr>
+            <w:tcW w:type="dxa" w:w="2426"/>
+            <w:shd w:fill="18324A"/>
+            <w:vAlign w:val="center"/>
+          </w:tcPr>
+          <w:p>
+            <w:r>
+              <w:rPr>
+                <w:b/>
+                <w:color w:val="FFFFFF"/>
+                <w:sz w:val="18"/>
+              </w:rPr>
+              <w:t>Title / source</w:t>
+            </w:r>
+          </w:p>
+        </w:tc>
+        <w:tc>
+          <w:tcPr>
+            <w:tcW w:type="dxa" w:w="2426"/>
+            <w:shd w:fill="18324A"/>
+            <w:vAlign w:val="center"/>
+          </w:tcPr>
+          <w:p>
+            <w:r>
+              <w:rPr>
+                <w:b/>
+                <w:color w:val="FFFFFF"/>
+                <w:sz w:val="18"/>
+              </w:rPr>
+              <w:t>Layer</w:t>
+            </w:r>
+          </w:p>
+        </w:tc>
+        <w:tc>
+          <w:tcPr>
+            <w:tcW w:type="dxa" w:w="2426"/>
+            <w:shd w:fill="18324A"/>
+            <w:vAlign w:val="center"/>
+          </w:tcPr>
+          <w:p>
+            <w:r>
+              <w:rPr>
+                <w:b/>
+                <w:color w:val="FFFFFF"/>
+                <w:sz w:val="18"/>
+              </w:rPr>
+              <w:t>License</w:t>
+            </w:r>
+          </w:p>
+        </w:tc>
+        <w:tc>
+          <w:tcPr>
+            <w:tcW w:type="dxa" w:w="2426"/>
+            <w:shd w:fill="18324A"/>
+            <w:vAlign w:val="center"/>
+          </w:tcPr>
+          <w:p>
+            <w:r>
+              <w:rPr>
+                <w:b/>
+                <w:color w:val="FFFFFF"/>
+                <w:sz w:val="18"/>
+              </w:rPr>
+              <w:t>Repository file</w:t>
+            </w:r>
+          </w:p>
+        </w:tc>
+      </w:tr>
+      <w:tr>
+        <w:trPr>
+          <w:cantSplit/>
+        </w:trPr>
+        <w:tc>
+          <w:tcPr>
+            <w:tcW w:type="dxa" w:w="2808"/>
+            <w:shd w:fill="EAF2F7"/>
+            <w:vAlign w:val="top"/>
+          </w:tcPr>
+          <w:p>
+            <w:pPr>
+              <w:spacing w:after="0"/>
+            </w:pPr>
+            <w:hyperlink r:id="rId68">
+              <w:r>
+                <w:rPr>
+                  <w:color w:val="0F766E"/>
+                  <w:u w:val="single"/>
+                </w:rPr>
+                <w:t>Valmiki Ramayana</w:t>
+              </w:r>
+            </w:hyperlink>
+            <w:r>
+              <w:rPr>
+                <w:i/>
+                <w:sz w:val="16"/>
+              </w:rPr>
+              <w:br/>
+              <w:t>ambuda-dcs</w:t>
+            </w:r>
+          </w:p>
+        </w:tc>
+        <w:tc>
+          <w:tcPr>
+            <w:tcW w:type="dxa" w:w="1944"/>
+            <w:shd w:fill="EAF2F7"/>
+            <w:vAlign w:val="top"/>
+          </w:tcPr>
+          <w:p>
+            <w:pPr>
+              <w:spacing w:after="0"/>
+            </w:pPr>
+            <w:r>
+              <w:rPr>
+                <w:sz w:val="16"/>
+              </w:rPr>
+              <w:t>root text</w:t>
+            </w:r>
+          </w:p>
+        </w:tc>
+        <w:tc>
+          <w:tcPr>
+            <w:tcW w:type="dxa" w:w="2088"/>
+            <w:shd w:fill="EAF2F7"/>
+            <w:vAlign w:val="top"/>
+          </w:tcPr>
+          <w:p>
+            <w:pPr>
+              <w:spacing w:after="0"/>
+            </w:pPr>
+            <w:hyperlink r:id="rId69">
+              <w:r>
+                <w:rPr>
+                  <w:color w:val="0F766E"/>
+                  <w:u w:val="single"/>
+                </w:rPr>
+                <w:t>CC-BY-4.0</w:t>
+              </w:r>
+            </w:hyperlink>
+          </w:p>
+        </w:tc>
+        <w:tc>
+          <w:tcPr>
+            <w:tcW w:type="dxa" w:w="2880"/>
+            <w:shd w:fill="EAF2F7"/>
+            <w:vAlign w:val="top"/>
+          </w:tcPr>
+          <w:p>
+            <w:pPr>
+              <w:spacing w:after="0"/>
+            </w:pPr>
+            <w:r>
+              <w:rPr>
+                <w:sz w:val="16"/>
+              </w:rPr>
+              <w:t>texts/cc-by-4.0/ambuda/ramayanam.txt</w:t>
+            </w:r>
+          </w:p>
+        </w:tc>
+      </w:tr>
+      <w:tr>
+        <w:trPr>
+          <w:cantSplit/>
+        </w:trPr>
+        <w:tc>
+          <w:tcPr>
+            <w:tcW w:type="dxa" w:w="2808"/>
+            <w:vAlign w:val="top"/>
+          </w:tcPr>
+          <w:p>
+            <w:pPr>
+              <w:spacing w:after="0"/>
+            </w:pPr>
+            <w:hyperlink r:id="rId70">
+              <w:r>
+                <w:rPr>
+                  <w:color w:val="0F766E"/>
+                  <w:u w:val="single"/>
+                </w:rPr>
+                <w:t>Mahabharata</w:t>
+              </w:r>
+            </w:hyperlink>
+            <w:r>
+              <w:rPr>
+                <w:i/>
+                <w:sz w:val="16"/>
+              </w:rPr>
+              <w:br/>
+              <w:t>ambuda-dcs</w:t>
+            </w:r>
+          </w:p>
+        </w:tc>
+        <w:tc>
+          <w:tcPr>
+            <w:tcW w:type="dxa" w:w="1944"/>
+            <w:vAlign w:val="top"/>
+          </w:tcPr>
+          <w:p>
+            <w:pPr>
+              <w:spacing w:after="0"/>
+            </w:pPr>
+            <w:r>
+              <w:rPr>
+                <w:sz w:val="16"/>
+              </w:rPr>
+              <w:t>root text</w:t>
+            </w:r>
+          </w:p>
+        </w:tc>
+        <w:tc>
+          <w:tcPr>
+            <w:tcW w:type="dxa" w:w="2088"/>
+            <w:vAlign w:val="top"/>
+          </w:tcPr>
+          <w:p>
+            <w:pPr>
+              <w:spacing w:after="0"/>
+            </w:pPr>
+            <w:hyperlink r:id="rId69">
+              <w:r>
+                <w:rPr>
+                  <w:color w:val="0F766E"/>
+                  <w:u w:val="single"/>
+                </w:rPr>
+                <w:t>CC-BY-4.0</w:t>
+              </w:r>
+            </w:hyperlink>
+          </w:p>
+        </w:tc>
+        <w:tc>
+          <w:tcPr>
+            <w:tcW w:type="dxa" w:w="2880"/>
+            <w:vAlign w:val="top"/>
+          </w:tcPr>
+          <w:p>
+            <w:pPr>
+              <w:spacing w:after="0"/>
+            </w:pPr>
+            <w:r>
+              <w:rPr>
+                <w:sz w:val="16"/>
+              </w:rPr>
+              <w:t>texts/cc-by-4.0/ambuda/mahabharatam.txt</w:t>
+            </w:r>
+          </w:p>
+        </w:tc>
+      </w:tr>
+      <w:tr>
+        <w:trPr>
+          <w:cantSplit/>
+        </w:trPr>
+        <w:tc>
+          <w:tcPr>
+            <w:tcW w:type="dxa" w:w="2808"/>
+            <w:shd w:fill="EAF2F7"/>
+            <w:vAlign w:val="top"/>
+          </w:tcPr>
+          <w:p>
+            <w:pPr>
+              <w:spacing w:after="0"/>
+            </w:pPr>
+            <w:hyperlink r:id="rId71">
+              <w:r>
+                <w:rPr>
+                  <w:color w:val="0F766E"/>
+                  <w:u w:val="single"/>
+                </w:rPr>
+                <w:t>Nyayasutra with Vatsyayana Nyayabhasya</w:t>
+              </w:r>
+            </w:hyperlink>
+            <w:r>
+              <w:rPr>
+                <w:i/>
+                <w:sz w:val="16"/>
+              </w:rPr>
+              <w:br/>
+              <w:t>sarit</w:t>
+            </w:r>
+          </w:p>
+        </w:tc>
+        <w:tc>
+          <w:tcPr>
+            <w:tcW w:type="dxa" w:w="1944"/>
+            <w:shd w:fill="EAF2F7"/>
+            <w:vAlign w:val="top"/>
+          </w:tcPr>
+          <w:p>
+            <w:pPr>
+              <w:spacing w:after="0"/>
+            </w:pPr>
+            <w:r>
+              <w:rPr>
+                <w:sz w:val="16"/>
+              </w:rPr>
+              <w:t>root text and commentary</w:t>
+            </w:r>
+          </w:p>
+        </w:tc>
+        <w:tc>
+          <w:tcPr>
+            <w:tcW w:type="dxa" w:w="2088"/>
+            <w:shd w:fill="EAF2F7"/>
+            <w:vAlign w:val="top"/>
+          </w:tcPr>
+          <w:p>
+            <w:pPr>
+              <w:spacing w:after="0"/>
+            </w:pPr>
+            <w:hyperlink r:id="rId72">
+              <w:r>
+                <w:rPr>
+                  <w:color w:val="0F766E"/>
+                  <w:u w:val="single"/>
+                </w:rPr>
+                <w:t>CC-BY-SA-3.0</w:t>
+              </w:r>
+            </w:hyperlink>
+          </w:p>
+        </w:tc>
+        <w:tc>
+          <w:tcPr>
+            <w:tcW w:type="dxa" w:w="2880"/>
+            <w:shd w:fill="EAF2F7"/>
+            <w:vAlign w:val="top"/>
+          </w:tcPr>
+          <w:p>
+            <w:pPr>
+              <w:spacing w:after="0"/>
+            </w:pPr>
+            <w:r>
+              <w:rPr>
+                <w:sz w:val="16"/>
+              </w:rPr>
+              <w:t>texts/cc-by-sa-3.0/sarit/vatsyayana-nyayabhasya.xml</w:t>
+            </w:r>
+          </w:p>
+        </w:tc>
+      </w:tr>
+      <w:tr>
+        <w:trPr>
+          <w:cantSplit/>
+        </w:trPr>
+        <w:tc>
+          <w:tcPr>
+            <w:tcW w:type="dxa" w:w="2808"/>
+            <w:vAlign w:val="top"/>
+          </w:tcPr>
+          <w:p>
+            <w:pPr>
+              <w:spacing w:after="0"/>
+            </w:pPr>
+            <w:hyperlink r:id="rId73">
+              <w:r>
+                <w:rPr>
+                  <w:color w:val="0F766E"/>
+                  <w:u w:val="single"/>
+                </w:rPr>
+                <w:t>Patanjalayogasastra (Yogasutra with Bhasya)</w:t>
+              </w:r>
+            </w:hyperlink>
+            <w:r>
+              <w:rPr>
+                <w:i/>
+                <w:sz w:val="16"/>
+              </w:rPr>
+              <w:br/>
+              <w:t>sarit</w:t>
+            </w:r>
+          </w:p>
+        </w:tc>
+        <w:tc>
+          <w:tcPr>
+            <w:tcW w:type="dxa" w:w="1944"/>
+            <w:vAlign w:val="top"/>
+          </w:tcPr>
+          <w:p>
+            <w:pPr>
+              <w:spacing w:after="0"/>
+            </w:pPr>
+            <w:r>
+              <w:rPr>
+                <w:sz w:val="16"/>
+              </w:rPr>
+              <w:t>root text and commentary</w:t>
+            </w:r>
+          </w:p>
+        </w:tc>
+        <w:tc>
+          <w:tcPr>
+            <w:tcW w:type="dxa" w:w="2088"/>
+            <w:vAlign w:val="top"/>
+          </w:tcPr>
+          <w:p>
+            <w:pPr>
+              <w:spacing w:after="0"/>
+            </w:pPr>
+            <w:hyperlink r:id="rId72">
+              <w:r>
+                <w:rPr>
+                  <w:color w:val="0F766E"/>
+                  <w:u w:val="single"/>
+                </w:rPr>
+                <w:t>CC-BY-SA-3.0</w:t>
+              </w:r>
+            </w:hyperlink>
+          </w:p>
+        </w:tc>
+        <w:tc>
+          <w:tcPr>
+            <w:tcW w:type="dxa" w:w="2880"/>
+            <w:vAlign w:val="top"/>
+          </w:tcPr>
+          <w:p>
+            <w:pPr>
+              <w:spacing w:after="0"/>
+            </w:pPr>
+            <w:r>
+              <w:rPr>
+                <w:sz w:val="16"/>
+              </w:rPr>
+              <w:t>texts/cc-by-sa-3.0/sarit/patanjalayogasastra.xml</w:t>
+            </w:r>
+          </w:p>
+        </w:tc>
+      </w:tr>
+      <w:tr>
+        <w:trPr>
+          <w:cantSplit/>
+        </w:trPr>
+        <w:tc>
+          <w:tcPr>
+            <w:tcW w:type="dxa" w:w="2808"/>
+            <w:shd w:fill="EAF2F7"/>
+            <w:vAlign w:val="top"/>
+          </w:tcPr>
+          <w:p>
+            <w:pPr>
+              <w:spacing w:after="0"/>
+            </w:pPr>
+            <w:hyperlink r:id="rId74">
+              <w:r>
+                <w:rPr>
+                  <w:color w:val="0F766E"/>
+                  <w:u w:val="single"/>
+                </w:rPr>
+                <w:t>Rajamartanda or Bhojavritti</w:t>
+              </w:r>
+            </w:hyperlink>
+            <w:r>
+              <w:rPr>
+                <w:i/>
+                <w:sz w:val="16"/>
+              </w:rPr>
+              <w:br/>
+              <w:t>sarit</w:t>
+            </w:r>
+          </w:p>
+        </w:tc>
+        <w:tc>
+          <w:tcPr>
+            <w:tcW w:type="dxa" w:w="1944"/>
+            <w:shd w:fill="EAF2F7"/>
+            <w:vAlign w:val="top"/>
+          </w:tcPr>
+          <w:p>
+            <w:pPr>
+              <w:spacing w:after="0"/>
+            </w:pPr>
+            <w:r>
+              <w:rPr>
+                <w:sz w:val="16"/>
+              </w:rPr>
+              <w:t>commentary</w:t>
+            </w:r>
+          </w:p>
+        </w:tc>
+        <w:tc>
+          <w:tcPr>
+            <w:tcW w:type="dxa" w:w="2088"/>
+            <w:shd w:fill="EAF2F7"/>
+            <w:vAlign w:val="top"/>
+          </w:tcPr>
+          <w:p>
+            <w:pPr>
+              <w:spacing w:after="0"/>
+            </w:pPr>
+            <w:hyperlink r:id="rId72">
+              <w:r>
+                <w:rPr>
+                  <w:color w:val="0F766E"/>
+                  <w:u w:val="single"/>
+                </w:rPr>
+                <w:t>CC-BY-SA-3.0</w:t>
+              </w:r>
+            </w:hyperlink>
+          </w:p>
+        </w:tc>
+        <w:tc>
+          <w:tcPr>
+            <w:tcW w:type="dxa" w:w="2880"/>
+            <w:shd w:fill="EAF2F7"/>
+            <w:vAlign w:val="top"/>
+          </w:tcPr>
+          <w:p>
+            <w:pPr>
+              <w:spacing w:after="0"/>
+            </w:pPr>
+            <w:r>
+              <w:rPr>
+                <w:sz w:val="16"/>
+              </w:rPr>
+              <w:t>texts/cc-by-sa-3.0/sarit/bhoja-rajamartanda.xml</w:t>
+            </w:r>
+          </w:p>
+        </w:tc>
+      </w:tr>
+      <w:tr>
+        <w:trPr>
+          <w:cantSplit/>
+        </w:trPr>
+        <w:tc>
+          <w:tcPr>
+            <w:tcW w:type="dxa" w:w="2808"/>
+            <w:vAlign w:val="top"/>
+          </w:tcPr>
+          <w:p>
+            <w:pPr>
+              <w:spacing w:after="0"/>
+            </w:pPr>
+            <w:hyperlink r:id="rId75">
+              <w:r>
+                <w:rPr>
+                  <w:color w:val="0F766E"/>
+                  <w:u w:val="single"/>
+                </w:rPr>
+                <w:t>Brahmapurana</w:t>
+              </w:r>
+            </w:hyperlink>
+            <w:r>
+              <w:rPr>
+                <w:i/>
+                <w:sz w:val="16"/>
+              </w:rPr>
+              <w:br/>
+              <w:t>sarit</w:t>
+            </w:r>
+          </w:p>
+        </w:tc>
+        <w:tc>
+          <w:tcPr>
+            <w:tcW w:type="dxa" w:w="1944"/>
+            <w:vAlign w:val="top"/>
+          </w:tcPr>
+          <w:p>
+            <w:pPr>
+              <w:spacing w:after="0"/>
+            </w:pPr>
+            <w:r>
+              <w:rPr>
+                <w:sz w:val="16"/>
+              </w:rPr>
+              <w:t>root text</w:t>
+            </w:r>
+          </w:p>
+        </w:tc>
+        <w:tc>
+          <w:tcPr>
+            <w:tcW w:type="dxa" w:w="2088"/>
+            <w:vAlign w:val="top"/>
+          </w:tcPr>
+          <w:p>
+            <w:pPr>
+              <w:spacing w:after="0"/>
+            </w:pPr>
+            <w:hyperlink r:id="rId72">
+              <w:r>
+                <w:rPr>
+                  <w:color w:val="0F766E"/>
+                  <w:u w:val="single"/>
+                </w:rPr>
+                <w:t>CC-BY-SA-3.0</w:t>
+              </w:r>
+            </w:hyperlink>
+          </w:p>
+        </w:tc>
+        <w:tc>
+          <w:tcPr>
+            <w:tcW w:type="dxa" w:w="2880"/>
+            <w:vAlign w:val="top"/>
+          </w:tcPr>
+          <w:p>
+            <w:pPr>
+              <w:spacing w:after="0"/>
+            </w:pPr>
+            <w:r>
+              <w:rPr>
+                <w:sz w:val="16"/>
+              </w:rPr>
+              <w:t>texts/cc-by-sa-3.0/sarit/brahmapurana.xml</w:t>
+            </w:r>
+          </w:p>
+        </w:tc>
+      </w:tr>
+      <w:tr>
+        <w:trPr>
+          <w:cantSplit/>
+        </w:trPr>
+        <w:tc>
+          <w:tcPr>
+            <w:tcW w:type="dxa" w:w="2808"/>
+            <w:shd w:fill="EAF2F7"/>
+            <w:vAlign w:val="top"/>
+          </w:tcPr>
+          <w:p>
+            <w:pPr>
+              <w:spacing w:after="0"/>
+            </w:pPr>
+            <w:hyperlink r:id="rId76">
+              <w:r>
+                <w:rPr>
+                  <w:color w:val="0F766E"/>
+                  <w:u w:val="single"/>
+                </w:rPr>
+                <w:t>Carakasamhita with Ayurvedadipika</w:t>
+              </w:r>
+            </w:hyperlink>
+            <w:r>
+              <w:rPr>
+                <w:i/>
+                <w:sz w:val="16"/>
+              </w:rPr>
+              <w:br/>
+              <w:t>sarit</w:t>
+            </w:r>
+          </w:p>
+        </w:tc>
+        <w:tc>
+          <w:tcPr>
+            <w:tcW w:type="dxa" w:w="1944"/>
+            <w:shd w:fill="EAF2F7"/>
+            <w:vAlign w:val="top"/>
+          </w:tcPr>
+          <w:p>
+            <w:pPr>
+              <w:spacing w:after="0"/>
+            </w:pPr>
+            <w:r>
+              <w:rPr>
+                <w:sz w:val="16"/>
+              </w:rPr>
+              <w:t>root text and commentary</w:t>
+            </w:r>
+          </w:p>
+        </w:tc>
+        <w:tc>
+          <w:tcPr>
+            <w:tcW w:type="dxa" w:w="2088"/>
+            <w:shd w:fill="EAF2F7"/>
+            <w:vAlign w:val="top"/>
+          </w:tcPr>
+          <w:p>
+            <w:pPr>
+              <w:spacing w:after="0"/>
+            </w:pPr>
+            <w:hyperlink r:id="rId72">
+              <w:r>
+                <w:rPr>
+                  <w:color w:val="0F766E"/>
+                  <w:u w:val="single"/>
+                </w:rPr>
+                <w:t>CC-BY-SA-3.0</w:t>
+              </w:r>
+            </w:hyperlink>
+          </w:p>
+        </w:tc>
+        <w:tc>
+          <w:tcPr>
+            <w:tcW w:type="dxa" w:w="2880"/>
+            <w:shd w:fill="EAF2F7"/>
+            <w:vAlign w:val="top"/>
+          </w:tcPr>
+          <w:p>
+            <w:pPr>
+              <w:spacing w:after="0"/>
+            </w:pPr>
+            <w:r>
+              <w:rPr>
+                <w:sz w:val="16"/>
+              </w:rPr>
+              <w:t>texts/cc-by-sa-3.0/sarit/carakasamhita.xml</w:t>
+            </w:r>
+          </w:p>
+        </w:tc>
+      </w:tr>
+      <w:tr>
+        <w:trPr>
+          <w:cantSplit/>
+        </w:trPr>
+        <w:tc>
+          <w:tcPr>
+            <w:tcW w:type="dxa" w:w="2808"/>
+            <w:vAlign w:val="top"/>
+          </w:tcPr>
+          <w:p>
+            <w:pPr>
+              <w:spacing w:after="0"/>
+            </w:pPr>
+            <w:hyperlink r:id="rId77">
+              <w:r>
+                <w:rPr>
+                  <w:color w:val="0F766E"/>
+                  <w:u w:val="single"/>
+                </w:rPr>
+                <w:t>Kautilya Arthasastra</w:t>
+              </w:r>
+            </w:hyperlink>
+            <w:r>
+              <w:rPr>
+                <w:i/>
+                <w:sz w:val="16"/>
+              </w:rPr>
+              <w:br/>
+              <w:t>sarit</w:t>
+            </w:r>
+          </w:p>
+        </w:tc>
+        <w:tc>
+          <w:tcPr>
+            <w:tcW w:type="dxa" w:w="1944"/>
+            <w:vAlign w:val="top"/>
+          </w:tcPr>
+          <w:p>
+            <w:pPr>
+              <w:spacing w:after="0"/>
+            </w:pPr>
+            <w:r>
+              <w:rPr>
+                <w:sz w:val="16"/>
+              </w:rPr>
+              <w:t>root text</w:t>
+            </w:r>
+          </w:p>
+        </w:tc>
+        <w:tc>
+          <w:tcPr>
+            <w:tcW w:type="dxa" w:w="2088"/>
+            <w:vAlign w:val="top"/>
+          </w:tcPr>
+          <w:p>
+            <w:pPr>
+              <w:spacing w:after="0"/>
+            </w:pPr>
+            <w:hyperlink r:id="rId72">
+              <w:r>
+                <w:rPr>
+                  <w:color w:val="0F766E"/>
+                  <w:u w:val="single"/>
+                </w:rPr>
+                <w:t>CC-BY-SA-3.0</w:t>
+              </w:r>
+            </w:hyperlink>
+          </w:p>
+        </w:tc>
+        <w:tc>
+          <w:tcPr>
+            <w:tcW w:type="dxa" w:w="2880"/>
+            <w:vAlign w:val="top"/>
+          </w:tcPr>
+          <w:p>
+            <w:pPr>
+              <w:spacing w:after="0"/>
+            </w:pPr>
+            <w:r>
+              <w:rPr>
+                <w:sz w:val="16"/>
+              </w:rPr>
+              <w:t>texts/cc-by-sa-3.0/sarit/kautalyarthasastra.xml</w:t>
+            </w:r>
+          </w:p>
+        </w:tc>
+      </w:tr>
+      <w:tr>
+        <w:trPr>
+          <w:cantSplit/>
+        </w:trPr>
+        <w:tc>
+          <w:tcPr>
+            <w:tcW w:type="dxa" w:w="2808"/>
+            <w:shd w:fill="EAF2F7"/>
+            <w:vAlign w:val="top"/>
+          </w:tcPr>
+          <w:p>
+            <w:pPr>
+              <w:spacing w:after="0"/>
+            </w:pPr>
+            <w:hyperlink r:id="rId78">
+              <w:r>
+                <w:rPr>
+                  <w:color w:val="0F766E"/>
+                  <w:u w:val="single"/>
+                </w:rPr>
+                <w:t>Manusmrti</w:t>
+              </w:r>
+            </w:hyperlink>
+            <w:r>
+              <w:rPr>
+                <w:i/>
+                <w:sz w:val="16"/>
+              </w:rPr>
+              <w:br/>
+              <w:t>sarit</w:t>
+            </w:r>
+          </w:p>
+        </w:tc>
+        <w:tc>
+          <w:tcPr>
+            <w:tcW w:type="dxa" w:w="1944"/>
+            <w:shd w:fill="EAF2F7"/>
+            <w:vAlign w:val="top"/>
+          </w:tcPr>
+          <w:p>
+            <w:pPr>
+              <w:spacing w:after="0"/>
+            </w:pPr>
+            <w:r>
+              <w:rPr>
+                <w:sz w:val="16"/>
+              </w:rPr>
+              <w:t>root text</w:t>
+            </w:r>
+          </w:p>
+        </w:tc>
+        <w:tc>
+          <w:tcPr>
+            <w:tcW w:type="dxa" w:w="2088"/>
+            <w:shd w:fill="EAF2F7"/>
+            <w:vAlign w:val="top"/>
+          </w:tcPr>
+          <w:p>
+            <w:pPr>
+              <w:spacing w:after="0"/>
+            </w:pPr>
+            <w:hyperlink r:id="rId72">
+              <w:r>
+                <w:rPr>
+                  <w:color w:val="0F766E"/>
+                  <w:u w:val="single"/>
+                </w:rPr>
+                <w:t>CC-BY-SA-3.0</w:t>
+              </w:r>
+            </w:hyperlink>
+          </w:p>
+        </w:tc>
+        <w:tc>
+          <w:tcPr>
+            <w:tcW w:type="dxa" w:w="2880"/>
+            <w:shd w:fill="EAF2F7"/>
+            <w:vAlign w:val="top"/>
+          </w:tcPr>
+          <w:p>
+            <w:pPr>
+              <w:spacing w:after="0"/>
+            </w:pPr>
+            <w:r>
+              <w:rPr>
+                <w:sz w:val="16"/>
+              </w:rPr>
+              <w:t>texts/cc-by-sa-3.0/sarit/manusmrti.xml</w:t>
+            </w:r>
+          </w:p>
+        </w:tc>
+      </w:tr>
+      <w:tr>
+        <w:trPr>
+          <w:cantSplit/>
+        </w:trPr>
+        <w:tc>
+          <w:tcPr>
+            <w:tcW w:type="dxa" w:w="2808"/>
+            <w:vAlign w:val="top"/>
+          </w:tcPr>
+          <w:p>
+            <w:pPr>
+              <w:spacing w:after="0"/>
+            </w:pPr>
+            <w:hyperlink r:id="rId79">
+              <w:r>
+                <w:rPr>
+                  <w:color w:val="0F766E"/>
+                  <w:u w:val="single"/>
+                </w:rPr>
+                <w:t>Naradasmrti</w:t>
+              </w:r>
+            </w:hyperlink>
+            <w:r>
+              <w:rPr>
+                <w:i/>
+                <w:sz w:val="16"/>
+              </w:rPr>
+              <w:br/>
+              <w:t>sarit</w:t>
+            </w:r>
+          </w:p>
+        </w:tc>
+        <w:tc>
+          <w:tcPr>
+            <w:tcW w:type="dxa" w:w="1944"/>
+            <w:vAlign w:val="top"/>
+          </w:tcPr>
+          <w:p>
+            <w:pPr>
+              <w:spacing w:after="0"/>
+            </w:pPr>
+            <w:r>
+              <w:rPr>
+                <w:sz w:val="16"/>
+              </w:rPr>
+              <w:t>root text</w:t>
+            </w:r>
+          </w:p>
+        </w:tc>
+        <w:tc>
+          <w:tcPr>
+            <w:tcW w:type="dxa" w:w="2088"/>
+            <w:vAlign w:val="top"/>
+          </w:tcPr>
+          <w:p>
+            <w:pPr>
+              <w:spacing w:after="0"/>
+            </w:pPr>
+            <w:hyperlink r:id="rId72">
+              <w:r>
+                <w:rPr>
+                  <w:color w:val="0F766E"/>
+                  <w:u w:val="single"/>
+                </w:rPr>
+                <w:t>CC-BY-SA-3.0</w:t>
+              </w:r>
+            </w:hyperlink>
+          </w:p>
+        </w:tc>
+        <w:tc>
+          <w:tcPr>
+            <w:tcW w:type="dxa" w:w="2880"/>
+            <w:vAlign w:val="top"/>
+          </w:tcPr>
+          <w:p>
+            <w:pPr>
+              <w:spacing w:after="0"/>
+            </w:pPr>
+            <w:r>
+              <w:rPr>
+                <w:sz w:val="16"/>
+              </w:rPr>
+              <w:t>texts/cc-by-sa-3.0/sarit/naradasmrti.xml</w:t>
+            </w:r>
+          </w:p>
+        </w:tc>
+      </w:tr>
+      <w:tr>
+        <w:trPr>
+          <w:cantSplit/>
+        </w:trPr>
+        <w:tc>
+          <w:tcPr>
+            <w:tcW w:type="dxa" w:w="2808"/>
+            <w:shd w:fill="EAF2F7"/>
+            <w:vAlign w:val="top"/>
+          </w:tcPr>
+          <w:p>
+            <w:pPr>
+              <w:spacing w:after="0"/>
+            </w:pPr>
+            <w:hyperlink r:id="rId80">
+              <w:r>
+                <w:rPr>
+                  <w:color w:val="0F766E"/>
+                  <w:u w:val="single"/>
+                </w:rPr>
+                <w:t>Padarthadharmasangraha</w:t>
+              </w:r>
+            </w:hyperlink>
+            <w:r>
+              <w:rPr>
+                <w:i/>
+                <w:sz w:val="16"/>
+              </w:rPr>
+              <w:br/>
+              <w:t>sarit</w:t>
+            </w:r>
+          </w:p>
+        </w:tc>
+        <w:tc>
+          <w:tcPr>
+            <w:tcW w:type="dxa" w:w="1944"/>
+            <w:shd w:fill="EAF2F7"/>
+            <w:vAlign w:val="top"/>
+          </w:tcPr>
+          <w:p>
+            <w:pPr>
+              <w:spacing w:after="0"/>
+            </w:pPr>
+            <w:r>
+              <w:rPr>
+                <w:sz w:val="16"/>
+              </w:rPr>
+              <w:t>root text</w:t>
+            </w:r>
+          </w:p>
+        </w:tc>
+        <w:tc>
+          <w:tcPr>
+            <w:tcW w:type="dxa" w:w="2088"/>
+            <w:shd w:fill="EAF2F7"/>
+            <w:vAlign w:val="top"/>
+          </w:tcPr>
+          <w:p>
+            <w:pPr>
+              <w:spacing w:after="0"/>
+            </w:pPr>
+            <w:hyperlink r:id="rId72">
+              <w:r>
+                <w:rPr>
+                  <w:color w:val="0F766E"/>
+                  <w:u w:val="single"/>
+                </w:rPr>
+                <w:t>CC-BY-SA-3.0</w:t>
+              </w:r>
+            </w:hyperlink>
+          </w:p>
+        </w:tc>
+        <w:tc>
+          <w:tcPr>
+            <w:tcW w:type="dxa" w:w="2880"/>
+            <w:shd w:fill="EAF2F7"/>
+            <w:vAlign w:val="top"/>
+          </w:tcPr>
+          <w:p>
+            <w:pPr>
+              <w:spacing w:after="0"/>
+            </w:pPr>
+            <w:r>
+              <w:rPr>
+                <w:sz w:val="16"/>
+              </w:rPr>
+              <w:t>texts/cc-by-sa-3.0/sarit/prasastapada-padarthadharmasangraha.xml</w:t>
+            </w:r>
+          </w:p>
+        </w:tc>
+      </w:tr>
+      <w:tr>
+        <w:trPr>
+          <w:cantSplit/>
+        </w:trPr>
+        <w:tc>
+          <w:tcPr>
+            <w:tcW w:type="dxa" w:w="2808"/>
+            <w:vAlign w:val="top"/>
+          </w:tcPr>
+          <w:p>
+            <w:pPr>
+              <w:spacing w:after="0"/>
+            </w:pPr>
+            <w:hyperlink r:id="rId81">
+              <w:r>
+                <w:rPr>
+                  <w:color w:val="0F766E"/>
+                  <w:u w:val="single"/>
+                </w:rPr>
+                <w:t>Susrutasamhita with classical commentaries</w:t>
+              </w:r>
+            </w:hyperlink>
+            <w:r>
+              <w:rPr>
+                <w:i/>
+                <w:sz w:val="16"/>
+              </w:rPr>
+              <w:br/>
+              <w:t>sarit</w:t>
+            </w:r>
+          </w:p>
+        </w:tc>
+        <w:tc>
+          <w:tcPr>
+            <w:tcW w:type="dxa" w:w="1944"/>
+            <w:vAlign w:val="top"/>
+          </w:tcPr>
+          <w:p>
+            <w:pPr>
+              <w:spacing w:after="0"/>
+            </w:pPr>
+            <w:r>
+              <w:rPr>
+                <w:sz w:val="16"/>
+              </w:rPr>
+              <w:t>root text and commentary</w:t>
+            </w:r>
+          </w:p>
+        </w:tc>
+        <w:tc>
+          <w:tcPr>
+            <w:tcW w:type="dxa" w:w="2088"/>
+            <w:vAlign w:val="top"/>
+          </w:tcPr>
+          <w:p>
+            <w:pPr>
+              <w:spacing w:after="0"/>
+            </w:pPr>
+            <w:hyperlink r:id="rId72">
+              <w:r>
+                <w:rPr>
+                  <w:color w:val="0F766E"/>
+                  <w:u w:val="single"/>
+                </w:rPr>
+                <w:t>CC-BY-SA-3.0</w:t>
+              </w:r>
+            </w:hyperlink>
+          </w:p>
+        </w:tc>
+        <w:tc>
+          <w:tcPr>
+            <w:tcW w:type="dxa" w:w="2880"/>
+            <w:vAlign w:val="top"/>
+          </w:tcPr>
+          <w:p>
+            <w:pPr>
+              <w:spacing w:after="0"/>
+            </w:pPr>
+            <w:r>
+              <w:rPr>
+                <w:sz w:val="16"/>
+              </w:rPr>
+              <w:t>texts/cc-by-sa-3.0/sarit/susrutasamhita.xml</w:t>
+            </w:r>
+          </w:p>
+        </w:tc>
+      </w:tr>
+      <w:tr>
+        <w:trPr>
+          <w:cantSplit/>
+        </w:trPr>
+        <w:tc>
+          <w:tcPr>
+            <w:tcW w:type="dxa" w:w="2808"/>
+            <w:shd w:fill="EAF2F7"/>
+            <w:vAlign w:val="top"/>
+          </w:tcPr>
+          <w:p>
+            <w:pPr>
+              <w:spacing w:after="0"/>
+            </w:pPr>
+            <w:hyperlink r:id="rId82">
+              <w:r>
+                <w:rPr>
+                  <w:color w:val="0F766E"/>
+                  <w:u w:val="single"/>
+                </w:rPr>
+                <w:t>Yogasutra with Tattvavaisaradi</w:t>
+              </w:r>
+            </w:hyperlink>
+            <w:r>
+              <w:rPr>
+                <w:i/>
+                <w:sz w:val="16"/>
+              </w:rPr>
+              <w:br/>
+              <w:t>sarit</w:t>
+            </w:r>
+          </w:p>
+        </w:tc>
+        <w:tc>
+          <w:tcPr>
+            <w:tcW w:type="dxa" w:w="1944"/>
+            <w:shd w:fill="EAF2F7"/>
+            <w:vAlign w:val="top"/>
+          </w:tcPr>
+          <w:p>
+            <w:pPr>
+              <w:spacing w:after="0"/>
+            </w:pPr>
+            <w:r>
+              <w:rPr>
+                <w:sz w:val="16"/>
+              </w:rPr>
+              <w:t>root text and commentary</w:t>
+            </w:r>
+          </w:p>
+        </w:tc>
+        <w:tc>
+          <w:tcPr>
+            <w:tcW w:type="dxa" w:w="2088"/>
+            <w:shd w:fill="EAF2F7"/>
+            <w:vAlign w:val="top"/>
+          </w:tcPr>
+          <w:p>
+            <w:pPr>
+              <w:spacing w:after="0"/>
+            </w:pPr>
+            <w:hyperlink r:id="rId72">
+              <w:r>
+                <w:rPr>
+                  <w:color w:val="0F766E"/>
+                  <w:u w:val="single"/>
+                </w:rPr>
+                <w:t>CC-BY-SA-3.0</w:t>
+              </w:r>
+            </w:hyperlink>
+          </w:p>
+        </w:tc>
+        <w:tc>
+          <w:tcPr>
+            <w:tcW w:type="dxa" w:w="2880"/>
+            <w:shd w:fill="EAF2F7"/>
+            <w:vAlign w:val="top"/>
+          </w:tcPr>
+          <w:p>
+            <w:pPr>
+              <w:spacing w:after="0"/>
+            </w:pPr>
+            <w:r>
+              <w:rPr>
+                <w:sz w:val="16"/>
+              </w:rPr>
+              <w:t>texts/cc-by-sa-3.0/sarit/vacaspati-tattvavaisaradi.xml</w:t>
+            </w:r>
+          </w:p>
+        </w:tc>
+      </w:tr>
+      <w:tr>
+        <w:trPr>
+          <w:cantSplit/>
+        </w:trPr>
+        <w:tc>
+          <w:tcPr>
+            <w:tcW w:type="dxa" w:w="2808"/>
+            <w:vAlign w:val="top"/>
+          </w:tcPr>
+          <w:p>
+            <w:pPr>
+              <w:spacing w:after="0"/>
+            </w:pPr>
+            <w:hyperlink r:id="rId83">
+              <w:r>
+                <w:rPr>
+                  <w:color w:val="0F766E"/>
+                  <w:u w:val="single"/>
+                </w:rPr>
+                <w:t>Tantravarttika of Kumarila Bhatta</w:t>
+              </w:r>
+            </w:hyperlink>
+            <w:r>
+              <w:rPr>
+                <w:i/>
+                <w:sz w:val="16"/>
+              </w:rPr>
+              <w:br/>
+              <w:t>sarit</w:t>
+            </w:r>
+          </w:p>
+        </w:tc>
+        <w:tc>
+          <w:tcPr>
+            <w:tcW w:type="dxa" w:w="1944"/>
+            <w:vAlign w:val="top"/>
+          </w:tcPr>
+          <w:p>
+            <w:pPr>
+              <w:spacing w:after="0"/>
+            </w:pPr>
+            <w:r>
+              <w:rPr>
+                <w:sz w:val="16"/>
+              </w:rPr>
+              <w:t>commentary</w:t>
+            </w:r>
+          </w:p>
+        </w:tc>
+        <w:tc>
+          <w:tcPr>
+            <w:tcW w:type="dxa" w:w="2088"/>
+            <w:vAlign w:val="top"/>
+          </w:tcPr>
+          <w:p>
+            <w:pPr>
+              <w:spacing w:after="0"/>
+            </w:pPr>
+            <w:hyperlink r:id="rId84">
+              <w:r>
+                <w:rPr>
+                  <w:color w:val="0F766E"/>
+                  <w:u w:val="single"/>
+                </w:rPr>
+                <w:t>CC-BY-SA-4.0</w:t>
+              </w:r>
+            </w:hyperlink>
+          </w:p>
+        </w:tc>
+        <w:tc>
+          <w:tcPr>
+            <w:tcW w:type="dxa" w:w="2880"/>
+            <w:vAlign w:val="top"/>
+          </w:tcPr>
+          <w:p>
+            <w:pPr>
+              <w:spacing w:after="0"/>
+            </w:pPr>
+            <w:r>
+              <w:rPr>
+                <w:sz w:val="16"/>
+              </w:rPr>
+              <w:t>texts/cc-by-sa-4.0/sarit/kumarila-tantravarttika.xml</w:t>
+            </w:r>
+          </w:p>
+        </w:tc>
+      </w:tr>
+      <w:tr>
+        <w:trPr>
+          <w:cantSplit/>
+        </w:trPr>
+        <w:tc>
+          <w:tcPr>
+            <w:tcW w:type="dxa" w:w="2808"/>
+            <w:shd w:fill="EAF2F7"/>
+            <w:vAlign w:val="top"/>
+          </w:tcPr>
+          <w:p>
+            <w:pPr>
+              <w:spacing w:after="0"/>
+            </w:pPr>
+            <w:hyperlink r:id="rId85">
+              <w:r>
+                <w:rPr>
+                  <w:color w:val="0F766E"/>
+                  <w:u w:val="single"/>
+                </w:rPr>
+                <w:t>Skandapurana critical edition chapters 1-69</w:t>
+              </w:r>
+            </w:hyperlink>
+            <w:r>
+              <w:rPr>
+                <w:i/>
+                <w:sz w:val="16"/>
+              </w:rPr>
+              <w:br/>
+              <w:t>sarit</w:t>
+            </w:r>
+          </w:p>
+        </w:tc>
+        <w:tc>
+          <w:tcPr>
+            <w:tcW w:type="dxa" w:w="1944"/>
+            <w:shd w:fill="EAF2F7"/>
+            <w:vAlign w:val="top"/>
+          </w:tcPr>
+          <w:p>
+            <w:pPr>
+              <w:spacing w:after="0"/>
+            </w:pPr>
+            <w:r>
+              <w:rPr>
+                <w:sz w:val="16"/>
+              </w:rPr>
+              <w:t>partial critical edition</w:t>
+            </w:r>
+          </w:p>
+        </w:tc>
+        <w:tc>
+          <w:tcPr>
+            <w:tcW w:type="dxa" w:w="2088"/>
+            <w:shd w:fill="EAF2F7"/>
+            <w:vAlign w:val="top"/>
+          </w:tcPr>
+          <w:p>
+            <w:pPr>
+              <w:spacing w:after="0"/>
+            </w:pPr>
+            <w:hyperlink r:id="rId84">
+              <w:r>
+                <w:rPr>
+                  <w:color w:val="0F766E"/>
+                  <w:u w:val="single"/>
+                </w:rPr>
+                <w:t>CC-BY-SA-4.0</w:t>
+              </w:r>
+            </w:hyperlink>
+          </w:p>
+        </w:tc>
+        <w:tc>
+          <w:tcPr>
+            <w:tcW w:type="dxa" w:w="2880"/>
+            <w:shd w:fill="EAF2F7"/>
+            <w:vAlign w:val="top"/>
+          </w:tcPr>
+          <w:p>
+            <w:pPr>
+              <w:spacing w:after="0"/>
+            </w:pPr>
+            <w:r>
+              <w:rPr>
+                <w:sz w:val="16"/>
+              </w:rPr>
+              <w:t>texts/cc-by-sa-4.0/sarit/skandapurana-adhyayas-1-69.xml</w:t>
+            </w:r>
+          </w:p>
+        </w:tc>
+      </w:tr>
+      <w:tr>
+        <w:trPr>
+          <w:cantSplit/>
+        </w:trPr>
+        <w:tc>
+          <w:tcPr>
+            <w:tcW w:type="dxa" w:w="2808"/>
+            <w:vAlign w:val="top"/>
+          </w:tcPr>
+          <w:p>
+            <w:pPr>
+              <w:spacing w:after="0"/>
+            </w:pPr>
+            <w:hyperlink r:id="rId86">
+              <w:r>
+                <w:rPr>
+                  <w:color w:val="0F766E"/>
+                  <w:u w:val="single"/>
+                </w:rPr>
+                <w:t>Mitaksara commentary on Yajnavalkya Dharmasastra</w:t>
+              </w:r>
+            </w:hyperlink>
+            <w:r>
+              <w:rPr>
+                <w:i/>
+                <w:sz w:val="16"/>
+              </w:rPr>
+              <w:br/>
+              <w:t>sarit</w:t>
+            </w:r>
+          </w:p>
+        </w:tc>
+        <w:tc>
+          <w:tcPr>
+            <w:tcW w:type="dxa" w:w="1944"/>
+            <w:vAlign w:val="top"/>
+          </w:tcPr>
+          <w:p>
+            <w:pPr>
+              <w:spacing w:after="0"/>
+            </w:pPr>
+            <w:r>
+              <w:rPr>
+                <w:sz w:val="16"/>
+              </w:rPr>
+              <w:t>root text and commentary</w:t>
+            </w:r>
+          </w:p>
+        </w:tc>
+        <w:tc>
+          <w:tcPr>
+            <w:tcW w:type="dxa" w:w="2088"/>
+            <w:vAlign w:val="top"/>
+          </w:tcPr>
+          <w:p>
+            <w:pPr>
+              <w:spacing w:after="0"/>
+            </w:pPr>
+            <w:hyperlink r:id="rId84">
+              <w:r>
+                <w:rPr>
+                  <w:color w:val="0F766E"/>
+                  <w:u w:val="single"/>
+                </w:rPr>
+                <w:t>CC-BY-SA-4.0</w:t>
+              </w:r>
+            </w:hyperlink>
+          </w:p>
+        </w:tc>
+        <w:tc>
+          <w:tcPr>
+            <w:tcW w:type="dxa" w:w="2880"/>
+            <w:vAlign w:val="top"/>
+          </w:tcPr>
+          <w:p>
+            <w:pPr>
+              <w:spacing w:after="0"/>
+            </w:pPr>
+            <w:r>
+              <w:rPr>
+                <w:sz w:val="16"/>
+              </w:rPr>
+              <w:t>texts/cc-by-sa-4.0/sarit/vijnanesvara-mitaksara.xml</w:t>
+            </w:r>
+          </w:p>
+        </w:tc>
+      </w:tr>
+      <w:tr>
+        <w:trPr>
+          <w:cantSplit/>
+        </w:trPr>
+        <w:tc>
+          <w:tcPr>
+            <w:tcW w:type="dxa" w:w="2808"/>
+            <w:shd w:fill="EAF2F7"/>
+            <w:vAlign w:val="top"/>
+          </w:tcPr>
+          <w:p>
+            <w:pPr>
+              <w:spacing w:after="0"/>
+            </w:pPr>
+            <w:hyperlink r:id="rId87">
+              <w:r>
+                <w:rPr>
+                  <w:color w:val="0F766E"/>
+                  <w:u w:val="single"/>
+                </w:rPr>
+                <w:t>The Song Celestial or Bhagavad-Gita</w:t>
+              </w:r>
+            </w:hyperlink>
+            <w:r>
+              <w:rPr>
+                <w:i/>
+                <w:sz w:val="16"/>
+              </w:rPr>
+              <w:br/>
+              <w:t>project-gutenberg</w:t>
+            </w:r>
+          </w:p>
+        </w:tc>
+        <w:tc>
+          <w:tcPr>
+            <w:tcW w:type="dxa" w:w="1944"/>
+            <w:shd w:fill="EAF2F7"/>
+            <w:vAlign w:val="top"/>
+          </w:tcPr>
+          <w:p>
+            <w:pPr>
+              <w:spacing w:after="0"/>
+            </w:pPr>
+            <w:r>
+              <w:rPr>
+                <w:sz w:val="16"/>
+              </w:rPr>
+              <w:t>english translation</w:t>
+            </w:r>
+          </w:p>
+        </w:tc>
+        <w:tc>
+          <w:tcPr>
+            <w:tcW w:type="dxa" w:w="2088"/>
+            <w:shd w:fill="EAF2F7"/>
+            <w:vAlign w:val="top"/>
+          </w:tcPr>
+          <w:p>
+            <w:pPr>
+              <w:spacing w:after="0"/>
+            </w:pPr>
+            <w:hyperlink r:id="rId88">
+              <w:r>
+                <w:rPr>
+                  <w:color w:val="0F766E"/>
+                  <w:u w:val="single"/>
+                </w:rPr>
+                <w:t>Public-Domain-US</w:t>
+              </w:r>
+            </w:hyperlink>
+          </w:p>
+        </w:tc>
+        <w:tc>
+          <w:tcPr>
+            <w:tcW w:type="dxa" w:w="2880"/>
+            <w:shd w:fill="EAF2F7"/>
+            <w:vAlign w:val="top"/>
+          </w:tcPr>
+          <w:p>
+            <w:pPr>
+              <w:spacing w:after="0"/>
+            </w:pPr>
+            <w:r>
+              <w:rPr>
+                <w:sz w:val="16"/>
+              </w:rPr>
+              <w:t>texts/public-domain-us/project-gutenberg/pg2388-bhagavad-gita.txt</w:t>
+            </w:r>
+          </w:p>
+        </w:tc>
+      </w:tr>
+      <w:tr>
+        <w:trPr>
+          <w:cantSplit/>
+        </w:trPr>
+        <w:tc>
+          <w:tcPr>
+            <w:tcW w:type="dxa" w:w="2808"/>
+            <w:vAlign w:val="top"/>
+          </w:tcPr>
+          <w:p>
+            <w:pPr>
+              <w:spacing w:after="0"/>
+            </w:pPr>
+            <w:hyperlink r:id="rId89">
+              <w:r>
+                <w:rPr>
+                  <w:color w:val="0F766E"/>
+                  <w:u w:val="single"/>
+                </w:rPr>
+                <w:t>The Yoga Sutras of Patanjali</w:t>
+              </w:r>
+            </w:hyperlink>
+            <w:r>
+              <w:rPr>
+                <w:i/>
+                <w:sz w:val="16"/>
+              </w:rPr>
+              <w:br/>
+              <w:t>project-gutenberg</w:t>
+            </w:r>
+          </w:p>
+        </w:tc>
+        <w:tc>
+          <w:tcPr>
+            <w:tcW w:type="dxa" w:w="1944"/>
+            <w:vAlign w:val="top"/>
+          </w:tcPr>
+          <w:p>
+            <w:pPr>
+              <w:spacing w:after="0"/>
+            </w:pPr>
+            <w:r>
+              <w:rPr>
+                <w:sz w:val="16"/>
+              </w:rPr>
+              <w:t>english translation and commentary</w:t>
+            </w:r>
+          </w:p>
+        </w:tc>
+        <w:tc>
+          <w:tcPr>
+            <w:tcW w:type="dxa" w:w="2088"/>
+            <w:vAlign w:val="top"/>
+          </w:tcPr>
+          <w:p>
+            <w:pPr>
+              <w:spacing w:after="0"/>
+            </w:pPr>
+            <w:hyperlink r:id="rId88">
+              <w:r>
+                <w:rPr>
+                  <w:color w:val="0F766E"/>
+                  <w:u w:val="single"/>
+                </w:rPr>
+                <w:t>Public-Domain-US</w:t>
+              </w:r>
+            </w:hyperlink>
+          </w:p>
+        </w:tc>
+        <w:tc>
+          <w:tcPr>
+            <w:tcW w:type="dxa" w:w="2880"/>
+            <w:vAlign w:val="top"/>
+          </w:tcPr>
+          <w:p>
+            <w:pPr>
+              <w:spacing w:after="0"/>
+            </w:pPr>
+            <w:r>
+              <w:rPr>
+                <w:sz w:val="16"/>
+              </w:rPr>
+              <w:t>texts/public-domain-us/project-gutenberg/pg2526-yoga-sutras.txt</w:t>
+            </w:r>
+          </w:p>
+        </w:tc>
+      </w:tr>
+      <w:tr>
+        <w:trPr>
+          <w:cantSplit/>
+        </w:trPr>
+        <w:tc>
+          <w:tcPr>
+            <w:tcW w:type="dxa" w:w="2808"/>
+            <w:shd w:fill="EAF2F7"/>
+            <w:vAlign w:val="top"/>
+          </w:tcPr>
+          <w:p>
+            <w:pPr>
+              <w:spacing w:after="0"/>
+            </w:pPr>
+            <w:hyperlink r:id="rId90">
+              <w:r>
+                <w:rPr>
+                  <w:color w:val="0F766E"/>
+                  <w:u w:val="single"/>
+                </w:rPr>
+                <w:t>The Upanishads: Isa Katha and Kena</w:t>
+              </w:r>
+            </w:hyperlink>
+            <w:r>
+              <w:rPr>
+                <w:i/>
+                <w:sz w:val="16"/>
+              </w:rPr>
+              <w:br/>
+              <w:t>project-gutenberg</w:t>
+            </w:r>
+          </w:p>
+        </w:tc>
+        <w:tc>
+          <w:tcPr>
+            <w:tcW w:type="dxa" w:w="1944"/>
+            <w:shd w:fill="EAF2F7"/>
+            <w:vAlign w:val="top"/>
+          </w:tcPr>
+          <w:p>
+            <w:pPr>
+              <w:spacing w:after="0"/>
+            </w:pPr>
+            <w:r>
+              <w:rPr>
+                <w:sz w:val="16"/>
+              </w:rPr>
+              <w:t>english translation and commentary</w:t>
+            </w:r>
+          </w:p>
+        </w:tc>
+        <w:tc>
+          <w:tcPr>
+            <w:tcW w:type="dxa" w:w="2088"/>
+            <w:shd w:fill="EAF2F7"/>
+            <w:vAlign w:val="top"/>
+          </w:tcPr>
+          <w:p>
+            <w:pPr>
+              <w:spacing w:after="0"/>
+            </w:pPr>
+            <w:hyperlink r:id="rId88">
+              <w:r>
+                <w:rPr>
+                  <w:color w:val="0F766E"/>
+                  <w:u w:val="single"/>
+                </w:rPr>
+                <w:t>Public-Domain-US</w:t>
+              </w:r>
+            </w:hyperlink>
+          </w:p>
+        </w:tc>
+        <w:tc>
+          <w:tcPr>
+            <w:tcW w:type="dxa" w:w="2880"/>
+            <w:shd w:fill="EAF2F7"/>
+            <w:vAlign w:val="top"/>
+          </w:tcPr>
+          <w:p>
+            <w:pPr>
+              <w:spacing w:after="0"/>
+            </w:pPr>
+            <w:r>
+              <w:rPr>
+                <w:sz w:val="16"/>
+              </w:rPr>
+              <w:t>texts/public-domain-us/project-gutenberg/pg3283-upanishads-paramananda.txt</w:t>
+            </w:r>
+          </w:p>
+        </w:tc>
+      </w:tr>
+      <w:tr>
+        <w:trPr>
+          <w:cantSplit/>
+        </w:trPr>
+        <w:tc>
+          <w:tcPr>
+            <w:tcW w:type="dxa" w:w="2808"/>
+            <w:vAlign w:val="top"/>
+          </w:tcPr>
+          <w:p>
+            <w:pPr>
+              <w:spacing w:after="0"/>
+            </w:pPr>
+            <w:hyperlink r:id="rId91">
+              <w:r>
+                <w:rPr>
+                  <w:color w:val="0F766E"/>
+                  <w:u w:val="single"/>
+                </w:rPr>
+                <w:t>The Vedanta-Sutras with Ramanuja's commentary</w:t>
+              </w:r>
+            </w:hyperlink>
+            <w:r>
+              <w:rPr>
+                <w:i/>
+                <w:sz w:val="16"/>
+              </w:rPr>
+              <w:br/>
+              <w:t>project-gutenberg</w:t>
+            </w:r>
+          </w:p>
+        </w:tc>
+        <w:tc>
+          <w:tcPr>
+            <w:tcW w:type="dxa" w:w="1944"/>
+            <w:vAlign w:val="top"/>
+          </w:tcPr>
+          <w:p>
+            <w:pPr>
+              <w:spacing w:after="0"/>
+            </w:pPr>
+            <w:r>
+              <w:rPr>
+                <w:sz w:val="16"/>
+              </w:rPr>
+              <w:t>english translation and commentary</w:t>
+            </w:r>
+          </w:p>
+        </w:tc>
+        <w:tc>
+          <w:tcPr>
+            <w:tcW w:type="dxa" w:w="2088"/>
+            <w:vAlign w:val="top"/>
+          </w:tcPr>
+          <w:p>
+            <w:pPr>
+              <w:spacing w:after="0"/>
+            </w:pPr>
+            <w:hyperlink r:id="rId88">
+              <w:r>
+                <w:rPr>
+                  <w:color w:val="0F766E"/>
+                  <w:u w:val="single"/>
+                </w:rPr>
+                <w:t>Public-Domain-US</w:t>
+              </w:r>
+            </w:hyperlink>
+          </w:p>
+        </w:tc>
+        <w:tc>
+          <w:tcPr>
+            <w:tcW w:type="dxa" w:w="2880"/>
+            <w:vAlign w:val="top"/>
+          </w:tcPr>
+          <w:p>
+            <w:pPr>
+              <w:spacing w:after="0"/>
+            </w:pPr>
+            <w:r>
+              <w:rPr>
+                <w:sz w:val="16"/>
+              </w:rPr>
+              <w:t>texts/public-domain-us/project-gutenberg/pg7297-vedanta-sutras-ramanuja.txt</w:t>
+            </w:r>
+          </w:p>
+        </w:tc>
+      </w:tr>
+      <w:tr>
+        <w:trPr>
+          <w:cantSplit/>
+        </w:trPr>
+        <w:tc>
+          <w:tcPr>
+            <w:tcW w:type="dxa" w:w="2808"/>
+            <w:shd w:fill="EAF2F7"/>
+            <w:vAlign w:val="top"/>
+          </w:tcPr>
+          <w:p>
+            <w:pPr>
+              <w:spacing w:after="0"/>
+            </w:pPr>
+            <w:hyperlink r:id="rId92">
+              <w:r>
+                <w:rPr>
+                  <w:color w:val="0F766E"/>
+                  <w:u w:val="single"/>
+                </w:rPr>
+                <w:t>The Mahabharata English prose volume 1 books 1-3</w:t>
+              </w:r>
+            </w:hyperlink>
+            <w:r>
+              <w:rPr>
+                <w:i/>
+                <w:sz w:val="16"/>
+              </w:rPr>
+              <w:br/>
+              <w:t>project-gutenberg</w:t>
+            </w:r>
+          </w:p>
+        </w:tc>
+        <w:tc>
+          <w:tcPr>
+            <w:tcW w:type="dxa" w:w="1944"/>
+            <w:shd w:fill="EAF2F7"/>
+            <w:vAlign w:val="top"/>
+          </w:tcPr>
+          <w:p>
+            <w:pPr>
+              <w:spacing w:after="0"/>
+            </w:pPr>
+            <w:r>
+              <w:rPr>
+                <w:sz w:val="16"/>
+              </w:rPr>
+              <w:t>english translation</w:t>
+            </w:r>
+          </w:p>
+        </w:tc>
+        <w:tc>
+          <w:tcPr>
+            <w:tcW w:type="dxa" w:w="2088"/>
+            <w:shd w:fill="EAF2F7"/>
+            <w:vAlign w:val="top"/>
+          </w:tcPr>
+          <w:p>
+            <w:pPr>
+              <w:spacing w:after="0"/>
+            </w:pPr>
+            <w:hyperlink r:id="rId88">
+              <w:r>
+                <w:rPr>
+                  <w:color w:val="0F766E"/>
+                  <w:u w:val="single"/>
+                </w:rPr>
+                <w:t>Public-Domain-US</w:t>
+              </w:r>
+            </w:hyperlink>
+          </w:p>
+        </w:tc>
+        <w:tc>
+          <w:tcPr>
+            <w:tcW w:type="dxa" w:w="2880"/>
+            <w:shd w:fill="EAF2F7"/>
+            <w:vAlign w:val="top"/>
+          </w:tcPr>
+          <w:p>
+            <w:pPr>
+              <w:spacing w:after="0"/>
+            </w:pPr>
+            <w:r>
+              <w:rPr>
+                <w:sz w:val="16"/>
+              </w:rPr>
+              <w:t>texts/public-domain-us/project-gutenberg/pg15474-mahabharata-vol-1.txt</w:t>
+            </w:r>
+          </w:p>
+        </w:tc>
+      </w:tr>
+      <w:tr>
+        <w:trPr>
+          <w:cantSplit/>
+        </w:trPr>
+        <w:tc>
+          <w:tcPr>
+            <w:tcW w:type="dxa" w:w="2808"/>
+            <w:vAlign w:val="top"/>
+          </w:tcPr>
+          <w:p>
+            <w:pPr>
+              <w:spacing w:after="0"/>
+            </w:pPr>
+            <w:hyperlink r:id="rId93">
+              <w:r>
+                <w:rPr>
+                  <w:color w:val="0F766E"/>
+                  <w:u w:val="single"/>
+                </w:rPr>
+                <w:t>The Mahabharata English prose volume 2 books 4-7</w:t>
+              </w:r>
+            </w:hyperlink>
+            <w:r>
+              <w:rPr>
+                <w:i/>
+                <w:sz w:val="16"/>
+              </w:rPr>
+              <w:br/>
+              <w:t>project-gutenberg</w:t>
+            </w:r>
+          </w:p>
+        </w:tc>
+        <w:tc>
+          <w:tcPr>
+            <w:tcW w:type="dxa" w:w="1944"/>
+            <w:vAlign w:val="top"/>
+          </w:tcPr>
+          <w:p>
+            <w:pPr>
+              <w:spacing w:after="0"/>
+            </w:pPr>
+            <w:r>
+              <w:rPr>
+                <w:sz w:val="16"/>
+              </w:rPr>
+              <w:t>english translation</w:t>
+            </w:r>
+          </w:p>
+        </w:tc>
+        <w:tc>
+          <w:tcPr>
+            <w:tcW w:type="dxa" w:w="2088"/>
+            <w:vAlign w:val="top"/>
+          </w:tcPr>
+          <w:p>
+            <w:pPr>
+              <w:spacing w:after="0"/>
+            </w:pPr>
+            <w:hyperlink r:id="rId88">
+              <w:r>
+                <w:rPr>
+                  <w:color w:val="0F766E"/>
+                  <w:u w:val="single"/>
+                </w:rPr>
+                <w:t>Public-Domain-US</w:t>
+              </w:r>
+            </w:hyperlink>
+          </w:p>
+        </w:tc>
+        <w:tc>
+          <w:tcPr>
+            <w:tcW w:type="dxa" w:w="2880"/>
+            <w:vAlign w:val="top"/>
+          </w:tcPr>
+          <w:p>
+            <w:pPr>
+              <w:spacing w:after="0"/>
+            </w:pPr>
+            <w:r>
+              <w:rPr>
+                <w:sz w:val="16"/>
+              </w:rPr>
+              <w:t>texts/public-domain-us/project-gutenberg/pg15475-mahabharata-vol-2.txt</w:t>
+            </w:r>
+          </w:p>
+        </w:tc>
+      </w:tr>
+      <w:tr>
+        <w:trPr>
+          <w:cantSplit/>
+        </w:trPr>
+        <w:tc>
+          <w:tcPr>
+            <w:tcW w:type="dxa" w:w="2808"/>
+            <w:shd w:fill="EAF2F7"/>
+            <w:vAlign w:val="top"/>
+          </w:tcPr>
+          <w:p>
+            <w:pPr>
+              <w:spacing w:after="0"/>
+            </w:pPr>
+            <w:hyperlink r:id="rId94">
+              <w:r>
+                <w:rPr>
+                  <w:color w:val="0F766E"/>
+                  <w:u w:val="single"/>
+                </w:rPr>
+                <w:t>The Mahabharata English prose volume 3 books 8-12</w:t>
+              </w:r>
+            </w:hyperlink>
+            <w:r>
+              <w:rPr>
+                <w:i/>
+                <w:sz w:val="16"/>
+              </w:rPr>
+              <w:br/>
+              <w:t>project-gutenberg</w:t>
+            </w:r>
+          </w:p>
+        </w:tc>
+        <w:tc>
+          <w:tcPr>
+            <w:tcW w:type="dxa" w:w="1944"/>
+            <w:shd w:fill="EAF2F7"/>
+            <w:vAlign w:val="top"/>
+          </w:tcPr>
+          <w:p>
+            <w:pPr>
+              <w:spacing w:after="0"/>
+            </w:pPr>
+            <w:r>
+              <w:rPr>
+                <w:sz w:val="16"/>
+              </w:rPr>
+              <w:t>english translation</w:t>
+            </w:r>
+          </w:p>
+        </w:tc>
+        <w:tc>
+          <w:tcPr>
+            <w:tcW w:type="dxa" w:w="2088"/>
+            <w:shd w:fill="EAF2F7"/>
+            <w:vAlign w:val="top"/>
+          </w:tcPr>
+          <w:p>
+            <w:pPr>
+              <w:spacing w:after="0"/>
+            </w:pPr>
+            <w:hyperlink r:id="rId88">
+              <w:r>
+                <w:rPr>
+                  <w:color w:val="0F766E"/>
+                  <w:u w:val="single"/>
+                </w:rPr>
+                <w:t>Public-Domain-US</w:t>
+              </w:r>
+            </w:hyperlink>
+          </w:p>
+        </w:tc>
+        <w:tc>
+          <w:tcPr>
+            <w:tcW w:type="dxa" w:w="2880"/>
+            <w:shd w:fill="EAF2F7"/>
+            <w:vAlign w:val="top"/>
+          </w:tcPr>
+          <w:p>
+            <w:pPr>
+              <w:spacing w:after="0"/>
+            </w:pPr>
+            <w:r>
+              <w:rPr>
+                <w:sz w:val="16"/>
+              </w:rPr>
+              <w:t>texts/public-domain-us/project-gutenberg/pg15476-mahabharata-vol-3.txt</w:t>
+            </w:r>
+          </w:p>
+        </w:tc>
+      </w:tr>
+      <w:tr>
+        <w:trPr>
+          <w:cantSplit/>
+        </w:trPr>
+        <w:tc>
+          <w:tcPr>
+            <w:tcW w:type="dxa" w:w="2808"/>
+            <w:vAlign w:val="top"/>
+          </w:tcPr>
+          <w:p>
+            <w:pPr>
+              <w:spacing w:after="0"/>
+            </w:pPr>
+            <w:hyperlink r:id="rId95">
+              <w:r>
+                <w:rPr>
+                  <w:color w:val="0F766E"/>
+                  <w:u w:val="single"/>
+                </w:rPr>
+                <w:t>The Mahabharata English prose volume 4 books 13-18</w:t>
+              </w:r>
+            </w:hyperlink>
+            <w:r>
+              <w:rPr>
+                <w:i/>
+                <w:sz w:val="16"/>
+              </w:rPr>
+              <w:br/>
+              <w:t>project-gutenberg</w:t>
+            </w:r>
+          </w:p>
+        </w:tc>
+        <w:tc>
+          <w:tcPr>
+            <w:tcW w:type="dxa" w:w="1944"/>
+            <w:vAlign w:val="top"/>
+          </w:tcPr>
+          <w:p>
+            <w:pPr>
+              <w:spacing w:after="0"/>
+            </w:pPr>
+            <w:r>
+              <w:rPr>
+                <w:sz w:val="16"/>
+              </w:rPr>
+              <w:t>english translation</w:t>
+            </w:r>
+          </w:p>
+        </w:tc>
+        <w:tc>
+          <w:tcPr>
+            <w:tcW w:type="dxa" w:w="2088"/>
+            <w:vAlign w:val="top"/>
+          </w:tcPr>
+          <w:p>
+            <w:pPr>
+              <w:spacing w:after="0"/>
+            </w:pPr>
+            <w:hyperlink r:id="rId88">
+              <w:r>
+                <w:rPr>
+                  <w:color w:val="0F766E"/>
+                  <w:u w:val="single"/>
+                </w:rPr>
+                <w:t>Public-Domain-US</w:t>
+              </w:r>
+            </w:hyperlink>
+          </w:p>
+        </w:tc>
+        <w:tc>
+          <w:tcPr>
+            <w:tcW w:type="dxa" w:w="2880"/>
+            <w:vAlign w:val="top"/>
+          </w:tcPr>
+          <w:p>
+            <w:pPr>
+              <w:spacing w:after="0"/>
+            </w:pPr>
+            <w:r>
+              <w:rPr>
+                <w:sz w:val="16"/>
+              </w:rPr>
+              <w:t>texts/public-domain-us/project-gutenberg/pg15477-mahabharata-vol-4.txt</w:t>
+            </w:r>
+          </w:p>
+        </w:tc>
+      </w:tr>
+      <w:tr>
+        <w:trPr>
+          <w:cantSplit/>
+        </w:trPr>
+        <w:tc>
+          <w:tcPr>
+            <w:tcW w:type="dxa" w:w="2808"/>
+            <w:shd w:fill="EAF2F7"/>
+            <w:vAlign w:val="top"/>
+          </w:tcPr>
+          <w:p>
+            <w:pPr>
+              <w:spacing w:after="0"/>
+            </w:pPr>
+            <w:hyperlink r:id="rId96">
+              <w:r>
+                <w:rPr>
+                  <w:color w:val="0F766E"/>
+                  <w:u w:val="single"/>
+                </w:rPr>
+                <w:t>The Vedanta-Sutras with Shankaracharya's commentary part 1</w:t>
+              </w:r>
+            </w:hyperlink>
+            <w:r>
+              <w:rPr>
+                <w:i/>
+                <w:sz w:val="16"/>
+              </w:rPr>
+              <w:br/>
+              <w:t>project-gutenberg</w:t>
+            </w:r>
+          </w:p>
+        </w:tc>
+        <w:tc>
+          <w:tcPr>
+            <w:tcW w:type="dxa" w:w="1944"/>
+            <w:shd w:fill="EAF2F7"/>
+            <w:vAlign w:val="top"/>
+          </w:tcPr>
+          <w:p>
+            <w:pPr>
+              <w:spacing w:after="0"/>
+            </w:pPr>
+            <w:r>
+              <w:rPr>
+                <w:sz w:val="16"/>
+              </w:rPr>
+              <w:t>english translation and commentary</w:t>
+            </w:r>
+          </w:p>
+        </w:tc>
+        <w:tc>
+          <w:tcPr>
+            <w:tcW w:type="dxa" w:w="2088"/>
+            <w:shd w:fill="EAF2F7"/>
+            <w:vAlign w:val="top"/>
+          </w:tcPr>
+          <w:p>
+            <w:pPr>
+              <w:spacing w:after="0"/>
+            </w:pPr>
+            <w:hyperlink r:id="rId88">
+              <w:r>
+                <w:rPr>
+                  <w:color w:val="0F766E"/>
+                  <w:u w:val="single"/>
+                </w:rPr>
+                <w:t>Public-Domain-US</w:t>
+              </w:r>
+            </w:hyperlink>
+          </w:p>
+        </w:tc>
+        <w:tc>
+          <w:tcPr>
+            <w:tcW w:type="dxa" w:w="2880"/>
+            <w:shd w:fill="EAF2F7"/>
+            <w:vAlign w:val="top"/>
+          </w:tcPr>
+          <w:p>
+            <w:pPr>
+              <w:spacing w:after="0"/>
+            </w:pPr>
+            <w:r>
+              <w:rPr>
+                <w:sz w:val="16"/>
+              </w:rPr>
+              <w:t>texts/public-domain-us/project-gutenberg/pg16295-vedanta-sutras-shankara.txt</w:t>
+            </w:r>
+          </w:p>
+        </w:tc>
+      </w:tr>
+      <w:tr>
+        <w:trPr>
+          <w:cantSplit/>
+        </w:trPr>
+        <w:tc>
+          <w:tcPr>
+            <w:tcW w:type="dxa" w:w="2808"/>
+            <w:vAlign w:val="top"/>
+          </w:tcPr>
+          <w:p>
+            <w:pPr>
+              <w:spacing w:after="0"/>
+            </w:pPr>
+            <w:hyperlink r:id="rId97">
+              <w:r>
+                <w:rPr>
+                  <w:color w:val="0F766E"/>
+                  <w:u w:val="single"/>
+                </w:rPr>
+                <w:t>A Prose English Translation of Harivamsha</w:t>
+              </w:r>
+            </w:hyperlink>
+            <w:r>
+              <w:rPr>
+                <w:i/>
+                <w:sz w:val="16"/>
+              </w:rPr>
+              <w:br/>
+              <w:t>project-gutenberg</w:t>
+            </w:r>
+          </w:p>
+        </w:tc>
+        <w:tc>
+          <w:tcPr>
+            <w:tcW w:type="dxa" w:w="1944"/>
+            <w:vAlign w:val="top"/>
+          </w:tcPr>
+          <w:p>
+            <w:pPr>
+              <w:spacing w:after="0"/>
+            </w:pPr>
+            <w:r>
+              <w:rPr>
+                <w:sz w:val="16"/>
+              </w:rPr>
+              <w:t>english translation</w:t>
+            </w:r>
+          </w:p>
+        </w:tc>
+        <w:tc>
+          <w:tcPr>
+            <w:tcW w:type="dxa" w:w="2088"/>
+            <w:vAlign w:val="top"/>
+          </w:tcPr>
+          <w:p>
+            <w:pPr>
+              <w:spacing w:after="0"/>
+            </w:pPr>
+            <w:hyperlink r:id="rId88">
+              <w:r>
+                <w:rPr>
+                  <w:color w:val="0F766E"/>
+                  <w:u w:val="single"/>
+                </w:rPr>
+                <w:t>Public-Domain-US</w:t>
+              </w:r>
+            </w:hyperlink>
+          </w:p>
+        </w:tc>
+        <w:tc>
+          <w:tcPr>
+            <w:tcW w:type="dxa" w:w="2880"/>
+            <w:vAlign w:val="top"/>
+          </w:tcPr>
+          <w:p>
+            <w:pPr>
+              <w:spacing w:after="0"/>
+            </w:pPr>
+            <w:r>
+              <w:rPr>
+                <w:sz w:val="16"/>
+              </w:rPr>
+              <w:t>texts/public-domain-us/project-gutenberg/pg61937-harivamsha.txt</w:t>
+            </w:r>
+          </w:p>
+        </w:tc>
+      </w:tr>
+      <w:tr>
+        <w:trPr>
+          <w:cantSplit/>
+        </w:trPr>
+        <w:tc>
+          <w:tcPr>
+            <w:tcW w:type="dxa" w:w="2808"/>
+            <w:shd w:fill="EAF2F7"/>
+            <w:vAlign w:val="top"/>
+          </w:tcPr>
+          <w:p>
+            <w:pPr>
+              <w:spacing w:after="0"/>
+            </w:pPr>
+            <w:hyperlink r:id="rId98">
+              <w:r>
+                <w:rPr>
+                  <w:color w:val="0F766E"/>
+                  <w:u w:val="single"/>
+                </w:rPr>
+                <w:t>A Prose English Translation of Vishnupuranam</w:t>
+              </w:r>
+            </w:hyperlink>
+            <w:r>
+              <w:rPr>
+                <w:i/>
+                <w:sz w:val="16"/>
+              </w:rPr>
+              <w:br/>
+              <w:t>project-gutenberg</w:t>
+            </w:r>
+          </w:p>
+        </w:tc>
+        <w:tc>
+          <w:tcPr>
+            <w:tcW w:type="dxa" w:w="1944"/>
+            <w:shd w:fill="EAF2F7"/>
+            <w:vAlign w:val="top"/>
+          </w:tcPr>
+          <w:p>
+            <w:pPr>
+              <w:spacing w:after="0"/>
+            </w:pPr>
+            <w:r>
+              <w:rPr>
+                <w:sz w:val="16"/>
+              </w:rPr>
+              <w:t>english translation</w:t>
+            </w:r>
+          </w:p>
+        </w:tc>
+        <w:tc>
+          <w:tcPr>
+            <w:tcW w:type="dxa" w:w="2088"/>
+            <w:shd w:fill="EAF2F7"/>
+            <w:vAlign w:val="top"/>
+          </w:tcPr>
+          <w:p>
+            <w:pPr>
+              <w:spacing w:after="0"/>
+            </w:pPr>
+            <w:hyperlink r:id="rId88">
+              <w:r>
+                <w:rPr>
+                  <w:color w:val="0F766E"/>
+                  <w:u w:val="single"/>
+                </w:rPr>
+                <w:t>Public-Domain-US</w:t>
+              </w:r>
+            </w:hyperlink>
+          </w:p>
+        </w:tc>
+        <w:tc>
+          <w:tcPr>
+            <w:tcW w:type="dxa" w:w="2880"/>
+            <w:shd w:fill="EAF2F7"/>
+            <w:vAlign w:val="top"/>
+          </w:tcPr>
+          <w:p>
+            <w:pPr>
+              <w:spacing w:after="0"/>
+            </w:pPr>
+            <w:r>
+              <w:rPr>
+                <w:sz w:val="16"/>
+              </w:rPr>
+              <w:t>texts/public-domain-us/project-gutenberg/pg66208-vishnupuranam.txt</w:t>
+            </w:r>
+          </w:p>
+        </w:tc>
+      </w:tr>
+      <w:tr>
+        <w:trPr>
+          <w:cantSplit/>
+        </w:trPr>
+        <w:tc>
+          <w:tcPr>
+            <w:tcW w:type="dxa" w:w="2808"/>
+            <w:vAlign w:val="top"/>
+          </w:tcPr>
+          <w:p>
+            <w:pPr>
+              <w:spacing w:after="0"/>
+            </w:pPr>
+            <w:hyperlink r:id="rId99">
+              <w:r>
+                <w:rPr>
+                  <w:color w:val="0F766E"/>
+                  <w:u w:val="single"/>
+                </w:rPr>
+                <w:t>The Upanishads Part I Sacred Books of the East volume 1</w:t>
+              </w:r>
+            </w:hyperlink>
+            <w:r>
+              <w:rPr>
+                <w:i/>
+                <w:sz w:val="16"/>
+              </w:rPr>
+              <w:br/>
+              <w:t>internet-archive</w:t>
+            </w:r>
+          </w:p>
+        </w:tc>
+        <w:tc>
+          <w:tcPr>
+            <w:tcW w:type="dxa" w:w="1944"/>
+            <w:vAlign w:val="top"/>
+          </w:tcPr>
+          <w:p>
+            <w:pPr>
+              <w:spacing w:after="0"/>
+            </w:pPr>
+            <w:r>
+              <w:rPr>
+                <w:sz w:val="16"/>
+              </w:rPr>
+              <w:t>english translation</w:t>
+            </w:r>
+          </w:p>
+        </w:tc>
+        <w:tc>
+          <w:tcPr>
+            <w:tcW w:type="dxa" w:w="2088"/>
+            <w:vAlign w:val="top"/>
+          </w:tcPr>
+          <w:p>
+            <w:pPr>
+              <w:spacing w:after="0"/>
+            </w:pPr>
+            <w:hyperlink r:id="rId100">
+              <w:r>
+                <w:rPr>
+                  <w:color w:val="0F766E"/>
+                  <w:u w:val="single"/>
+                </w:rPr>
+                <w:t>Public-Domain-US</w:t>
+              </w:r>
+            </w:hyperlink>
+          </w:p>
+        </w:tc>
+        <w:tc>
+          <w:tcPr>
+            <w:tcW w:type="dxa" w:w="2880"/>
+            <w:vAlign w:val="top"/>
+          </w:tcPr>
+          <w:p>
+            <w:pPr>
+              <w:spacing w:after="0"/>
+            </w:pPr>
+            <w:r>
+              <w:rPr>
+                <w:sz w:val="16"/>
+              </w:rPr>
+              <w:t>texts/public-domain-us/internet-archive/upanishads-sbe-vol-1-ocr.txt</w:t>
+            </w:r>
+          </w:p>
+        </w:tc>
+      </w:tr>
+      <w:tr>
+        <w:trPr>
+          <w:cantSplit/>
+        </w:trPr>
+        <w:tc>
+          <w:tcPr>
+            <w:tcW w:type="dxa" w:w="2808"/>
+            <w:shd w:fill="EAF2F7"/>
+            <w:vAlign w:val="top"/>
+          </w:tcPr>
+          <w:p>
+            <w:pPr>
+              <w:spacing w:after="0"/>
+            </w:pPr>
+            <w:hyperlink r:id="rId101">
+              <w:r>
+                <w:rPr>
+                  <w:color w:val="0F766E"/>
+                  <w:u w:val="single"/>
+                </w:rPr>
+                <w:t>The Upanishads Part II Sacred Books of the East volume 15</w:t>
+              </w:r>
+            </w:hyperlink>
+            <w:r>
+              <w:rPr>
+                <w:i/>
+                <w:sz w:val="16"/>
+              </w:rPr>
+              <w:br/>
+              <w:t>internet-archive</w:t>
+            </w:r>
+          </w:p>
+        </w:tc>
+        <w:tc>
+          <w:tcPr>
+            <w:tcW w:type="dxa" w:w="1944"/>
+            <w:shd w:fill="EAF2F7"/>
+            <w:vAlign w:val="top"/>
+          </w:tcPr>
+          <w:p>
+            <w:pPr>
+              <w:spacing w:after="0"/>
+            </w:pPr>
+            <w:r>
+              <w:rPr>
+                <w:sz w:val="16"/>
+              </w:rPr>
+              <w:t>english translation</w:t>
+            </w:r>
+          </w:p>
+        </w:tc>
+        <w:tc>
+          <w:tcPr>
+            <w:tcW w:type="dxa" w:w="2088"/>
+            <w:shd w:fill="EAF2F7"/>
+            <w:vAlign w:val="top"/>
+          </w:tcPr>
+          <w:p>
+            <w:pPr>
+              <w:spacing w:after="0"/>
+            </w:pPr>
+            <w:hyperlink r:id="rId100">
+              <w:r>
+                <w:rPr>
+                  <w:color w:val="0F766E"/>
+                  <w:u w:val="single"/>
+                </w:rPr>
+                <w:t>Public-Domain-US</w:t>
+              </w:r>
+            </w:hyperlink>
+          </w:p>
+        </w:tc>
+        <w:tc>
+          <w:tcPr>
+            <w:tcW w:type="dxa" w:w="2880"/>
+            <w:shd w:fill="EAF2F7"/>
+            <w:vAlign w:val="top"/>
+          </w:tcPr>
+          <w:p>
+            <w:pPr>
+              <w:spacing w:after="0"/>
+            </w:pPr>
+            <w:r>
+              <w:rPr>
+                <w:sz w:val="16"/>
+              </w:rPr>
+              <w:t>texts/public-domain-us/internet-archive/upanishads-sbe-vol-15-ocr.txt</w:t>
+            </w:r>
+          </w:p>
+        </w:tc>
+      </w:tr>
+    </w:tbl>
+    <w:p>
+      <w:pPr>
+        <w:pStyle w:val="Heading2"/>
+      </w:pPr>
+      <w:r>
+        <w:t>What remains</w:t>
+      </w:r>
+    </w:p>
+    <w:p>
+      <w:r>
+        <w:t>The remaining 195 catalogue records stay as discovery links until a complete, exact Sanskrit or English edition has a verifiable reuse basis. This protects the public repository from silently republishing modern copyrighted translations or critical editions. See catalog/COVERAGE.md for the live status.</w:t>
+      </w:r>
+    </w:p>
     <w:sectPr>
       <w:headerReference w:type="default" r:id="rId9"/>
       <w:footerReference w:type="default" r:id="rId10"/>
       <w:pgSz w:w="12240" w:h="15840"/>
-      <w:pgMar w:top="1181" w:right="1267" w:bottom="1094" w:left="1267" w:header="490" w:footer="490" w:gutter="0"/>
+      <w:pgMar w:top="936" w:right="1008" w:bottom="936" w:left="1008" w:header="490" w:footer="490" w:gutter="0"/>
       <w:cols w:space="720"/>
       <w:docGrid w:linePitch="360"/>
     </w:sectPr>

</xml_diff>